<commit_message>
Nettoyé modèles DOCX devis
Co-authored-by: nanouf69 <271506975+nanouf69@users.noreply.github.com>
</commit_message>
<xml_diff>
--- a/public/devis/Devis_TAXI_elearning_avec_examen.docx
+++ b/public/devis/Devis_TAXI_elearning_avec_examen.docx
@@ -650,7 +650,7 @@
               </w:rPr>
             </w:pPr>
             <w:r>
-              <w:t>${client_nom}</w:t>
+              <w:t/>
             </w:r>
           </w:p>
         </w:tc>
@@ -1480,10 +1480,7 @@
           <w:color w:val="000000" w:themeColor="text1"/>
           <w:szCs w:val="24"/>
         </w:rPr>
-        <w:t xml:space="preserve"> ${</w:t>
-      </w:r>
-      <w:r>
-        <w:t>client_mail}</w:t>
+        <w:t xml:space="preserve"> </w:t>
       </w:r>
     </w:p>
     <w:p>
@@ -4070,7 +4067,7 @@
         <w:ind w:left="567"/>
       </w:pPr>
       <w:r>
-        <w:t>Fait à Lyon, le ${devis_date} (document à renvoyer)</w:t>
+        <w:t>Fait à Lyon, le  (document à renvoyer)</w:t>
       </w:r>
     </w:p>
     <w:p>

</xml_diff>